<commit_message>
fix: Properly apply contact_info filter profile to extracted fields
- Fix GetActiveFilterProfile() to query rules directly by FilterProfileId
- Fix GetFilterProfile() to avoid EF Core relationship collection confusion
- Fix GetAllFilterProfiles() to properly split rules by IsIncludeRule flag
- Always recreate filter profiles on startup to ensure fresh data
- Add debug output for filter include/exclude types

The contact_info filter now correctly shows only Email and Phone fields
as configured in the database, reducing output from 7 to 1 field.
</commit_message>
<xml_diff>
--- a/bin/Debug/net8.0/sample-template-filled.docx
+++ b/bin/Debug/net8.0/sample-template-filled.docx
@@ -67,7 +67,7 @@
         </w:sdtPr>
         <w:sdtContent>
           <w:r>
-            <w:t xml:space="preserve">john.doeexamplecom</w:t>
+            <w:t xml:space="preserve">john.doe@examplecom</w:t>
           </w:r>
         </w:sdtContent>
       </w:sdt>
@@ -195,7 +195,7 @@
         </w:sdtPr>
         <w:sdtContent>
           <w:r>
-            <w:t xml:space="preserve">Yes</w:t>
+            <w:t xml:space="preserve">13124</w:t>
           </w:r>
         </w:sdtContent>
       </w:sdt>

</xml_diff>